<commit_message>
updated stand alone notebooks
</commit_message>
<xml_diff>
--- a/documents/ProjectOutline.docx
+++ b/documents/ProjectOutline.docx
@@ -3274,6 +3274,7 @@
         <w:rPr>
           <w:rFonts w:ascii="Arial" w:hAnsi="Arial" w:cs="Arial"/>
         </w:rPr>
+        <w:lastRenderedPageBreak/>
         <w:t>(I) Examining Two “Shot-Gun” Proteomics Experiments</w:t>
       </w:r>
       <w:bookmarkEnd w:id="1"/>
@@ -3617,7 +3618,6 @@
         <w:rPr>
           <w:rFonts w:ascii="Arial" w:hAnsi="Arial" w:cs="Arial"/>
         </w:rPr>
-        <w:lastRenderedPageBreak/>
         <w:br/>
         <w:t>[2] DOI: 10.3390/ijms22020920, Des: Cheng L, Min W, Li M, Zhou L, Hsu CC, Yang X, Jiang X, Ruan Z, Zhong Y, Wang ZY, Wang W. Quantitative Proteomics Reveals that GmENO2 Proteins Are Involved in Response to Phosphate Starvation in the Leaves of Glycine max L. Int J Mol Sci. 2021 22(2)</w:t>
       </w:r>
@@ -3766,6 +3766,7 @@
         <w:rPr>
           <w:rFonts w:ascii="Arial" w:hAnsi="Arial" w:cs="Arial"/>
         </w:rPr>
+        <w:lastRenderedPageBreak/>
         <w:t xml:space="preserve">Table </w:t>
       </w:r>
       <w:r>
@@ -5191,7 +5192,6 @@
         <w:rPr>
           <w:rFonts w:ascii="Arial" w:hAnsi="Arial" w:cs="Arial"/>
         </w:rPr>
-        <w:lastRenderedPageBreak/>
         <w:t>TMT-Labeled Data</w:t>
       </w:r>
     </w:p>
@@ -5899,7 +5899,6 @@
         <w:rPr>
           <w:rFonts w:ascii="Arial" w:hAnsi="Arial" w:cs="Arial"/>
         </w:rPr>
-        <w:lastRenderedPageBreak/>
         <w:t>Static Modifications</w:t>
       </w:r>
     </w:p>
@@ -7288,7 +7287,6 @@
         <w:rPr>
           <w:rFonts w:ascii="Arial" w:hAnsi="Arial" w:cs="Arial"/>
         </w:rPr>
-        <w:lastRenderedPageBreak/>
         <w:t>(II): Open Modification Search with Spectral Alignment Guided Engine (SAGE)</w:t>
       </w:r>
       <w:bookmarkEnd w:id="9"/>
@@ -7394,6 +7392,7 @@
         <w:rPr>
           <w:rFonts w:ascii="Arial" w:hAnsi="Arial" w:cs="Arial"/>
         </w:rPr>
+        <w:lastRenderedPageBreak/>
         <w:t>Studies requiring open or semi-open modification searches</w:t>
       </w:r>
     </w:p>
@@ -8040,6 +8039,7 @@
                 <w:rFonts w:ascii="Arial" w:hAnsi="Arial" w:cs="Arial"/>
                 <w:szCs w:val="22"/>
               </w:rPr>
+              <w:lastRenderedPageBreak/>
               <w:t>peptide</w:t>
             </w:r>
           </w:p>
@@ -8515,7 +8515,6 @@
         <w:rPr>
           <w:rFonts w:ascii="Arial" w:hAnsi="Arial" w:cs="Arial"/>
         </w:rPr>
-        <w:lastRenderedPageBreak/>
         <w:t xml:space="preserve">Q. </w:t>
       </w:r>
       <w:r>
@@ -8900,6 +8899,7 @@
           <w:rFonts w:ascii="Arial" w:hAnsi="Arial" w:cs="Arial"/>
           <w:u w:val="single"/>
         </w:rPr>
+        <w:lastRenderedPageBreak/>
         <w:t>N</w:t>
       </w:r>
       <w:r>
@@ -9213,7 +9213,6 @@
         <w:rPr>
           <w:rFonts w:ascii="Arial" w:hAnsi="Arial" w:cs="Arial"/>
         </w:rPr>
-        <w:lastRenderedPageBreak/>
         <w:t xml:space="preserve">(III – 3) </w:t>
       </w:r>
       <w:r>
@@ -9528,7 +9527,38 @@
         <w:rPr>
           <w:rFonts w:ascii="Arial" w:hAnsi="Arial" w:cs="Arial"/>
         </w:rPr>
-        <w:t>The estimate protein abundance first and third quartiles</w:t>
+        <w:t>The estimate</w:t>
+      </w:r>
+      <w:r>
+        <w:rPr>
+          <w:rFonts w:ascii="Arial" w:hAnsi="Arial" w:cs="Arial"/>
+        </w:rPr>
+        <w:t>d</w:t>
+      </w:r>
+      <w:r>
+        <w:rPr>
+          <w:rFonts w:ascii="Arial" w:hAnsi="Arial" w:cs="Arial"/>
+        </w:rPr>
+        <w:t xml:space="preserve"> protein abundance first and third quartiles</w:t>
+      </w:r>
+    </w:p>
+    <w:p>
+      <w:pPr>
+        <w:pStyle w:val="Compact"/>
+        <w:numPr>
+          <w:ilvl w:val="0"/>
+          <w:numId w:val="12"/>
+        </w:numPr>
+        <w:spacing w:line="276" w:lineRule="auto"/>
+        <w:rPr>
+          <w:rFonts w:ascii="Arial" w:hAnsi="Arial" w:cs="Arial"/>
+        </w:rPr>
+      </w:pPr>
+      <w:r>
+        <w:rPr>
+          <w:rFonts w:ascii="Arial" w:hAnsi="Arial" w:cs="Arial"/>
+        </w:rPr>
+        <w:t xml:space="preserve">The estimated protein abundance variance </w:t>
       </w:r>
     </w:p>
     <w:p>
@@ -9552,6 +9582,7 @@
         <w:rPr>
           <w:rFonts w:ascii="Arial" w:hAnsi="Arial" w:cs="Arial"/>
         </w:rPr>
+        <w:lastRenderedPageBreak/>
         <w:t xml:space="preserve">Q. </w:t>
       </w:r>
       <w:r>
@@ -9837,7 +9868,6 @@
         <w:rPr>
           <w:rFonts w:ascii="Arial" w:hAnsi="Arial" w:cs="Arial"/>
         </w:rPr>
-        <w:lastRenderedPageBreak/>
         <w:t>Caveat: Standardizing separately means the two groups are no longer directly on the same absolute scale</w:t>
       </w:r>
       <w:r>
@@ -10174,6 +10204,7 @@
         <w:rPr>
           <w:rFonts w:ascii="Arial" w:hAnsi="Arial" w:cs="Arial"/>
         </w:rPr>
+        <w:lastRenderedPageBreak/>
         <w:t xml:space="preserve">(IV – 3) </w:t>
       </w:r>
       <w:r>
@@ -10411,7 +10442,6 @@
           <w:rFonts w:ascii="Arial" w:hAnsi="Arial" w:cs="Arial"/>
           <w:u w:val="single"/>
         </w:rPr>
-        <w:lastRenderedPageBreak/>
         <w:t>Axes</w:t>
       </w:r>
       <w:r>
@@ -11327,7 +11357,6 @@
         <w:docPartUnique/>
       </w:docPartObj>
     </w:sdtPr>
-    <w:sdtEndPr/>
     <w:sdtContent>
       <w:sdt>
         <w:sdtPr>
@@ -11337,7 +11366,6 @@
             <w:docPartUnique/>
           </w:docPartObj>
         </w:sdtPr>
-        <w:sdtEndPr/>
         <w:sdtContent>
           <w:p>
             <w:pPr>

</xml_diff>